<commit_message>
copy: mark Okulium as his own product, restore production support
Without the old "Personal Projects" heading nothing on the page said
Okulium is his, and a reader could assume ITG built it. The layout change
had also dropped the production-support bullet, which he confirmed and
which several target roles ask about; it is back, split from the testing
line. Still two pages; PDF and .docx match at 717 words.

Co-Authored-By: Claude Opus 5.5 <noreply@anthropic.com>
</commit_message>
<xml_diff>
--- a/Hammad_Ali_Resume.docx
+++ b/Hammad_Ali_Resume.docx
@@ -556,7 +556,31 @@
           <w:sz w:val="20"/>
           <w:szCs w:val="20"/>
         </w:rPr>
-        <w:t xml:space="preserve">Write unit and integration tests with Vitest, run code reviews, and ship Docker-based services through CI/CD.</w:t>
+        <w:t xml:space="preserve">Write unit and integration tests with Vitest and run code reviews across the team before work is merged.</w:t>
+      </w:r>
+    </w:p>
+    <w:p>
+      <w:pPr>
+        <w:spacing w:before="0" w:after="40" w:line="276" w:lineRule="auto"/>
+        <w:ind w:left="284" w:hanging="284"/>
+      </w:pPr>
+      <w:r>
+        <w:rPr>
+          <w:rFonts w:ascii="Segoe UI" w:hAnsi="Segoe UI" w:cs="Segoe UI"/>
+          <w:color w:val="000000"/>
+          <w:sz w:val="20"/>
+          <w:szCs w:val="20"/>
+        </w:rPr>
+        <w:t xml:space="preserve">•   </w:t>
+      </w:r>
+      <w:r>
+        <w:rPr>
+          <w:rFonts w:ascii="Segoe UI" w:hAnsi="Segoe UI" w:cs="Segoe UI"/>
+          <w:color w:val="000000"/>
+          <w:sz w:val="20"/>
+          <w:szCs w:val="20"/>
+        </w:rPr>
+        <w:t xml:space="preserve">Ship Docker-based services through CI/CD and resolve production issues across frontend, API and database layers.</w:t>
       </w:r>
     </w:p>
     <w:p>
@@ -918,7 +942,7 @@
           <w:sz w:val="20"/>
           <w:szCs w:val="20"/>
         </w:rPr>
-        <w:t xml:space="preserve"> - Multi-Tenant School Management SaaS </w:t>
+        <w:t xml:space="preserve"> - Multi-Tenant School Management SaaS (Own Product) </w:t>
       </w:r>
       <w:r>
         <w:rPr>

</xml_diff>